<commit_message>
Atualiza o DERS com o comportamento implementado: artigo em janela sobreposta, midia incorporada, datas do filtro opcionais, correcao de Longitude no Quadro 16, endereco do autor e banco no Supabase
</commit_message>
<xml_diff>
--- a/FernandoSilva_relatorio_DERS2.docx
+++ b/FernandoSilva_relatorio_DERS2.docx
@@ -15583,7 +15583,7 @@
           <w:noProof w:val="0"/>
           <w:lang w:val="pt-BR"/>
         </w:rPr>
-        <w:t>3. Ao clicar sobre o marcador (PIN), o sistema abre uma nova aba no navegador carregando a página completa do artigo histórico, apresentando a seguinte estrutura:</w:t>
+        <w:t>3. Ao clicar sobre o marcador (PIN), o sistema abre o artigo histórico em uma janela sobreposta ao mapa, na mesma aba, apresentando a seguinte estrutura:</w:t>
       </w:r>
     </w:p>
     <w:p>
@@ -15969,7 +15969,7 @@
                 <w:noProof w:val="0"/>
                 <w:lang w:val="pt-BR"/>
               </w:rPr>
-              <w:t>Links de Imagens</w:t>
+              <w:t>Imagens incorporadas</w:t>
             </w:r>
           </w:p>
         </w:tc>
@@ -16064,7 +16064,7 @@
                 <w:noProof w:val="0"/>
                 <w:lang w:val="pt-BR"/>
               </w:rPr>
-              <w:t>Links de Áudios</w:t>
+              <w:t>Áudios incorporados</w:t>
             </w:r>
           </w:p>
         </w:tc>
@@ -16159,7 +16159,7 @@
                 <w:noProof w:val="0"/>
                 <w:lang w:val="pt-BR"/>
               </w:rPr>
-              <w:t>Links de Vídeos</w:t>
+              <w:t>Vídeos incorporados</w:t>
             </w:r>
           </w:p>
         </w:tc>
@@ -16352,7 +16352,7 @@
           <w:noProof w:val="0"/>
           <w:lang w:val="pt-BR"/>
         </w:rPr>
-        <w:t>1. O conteúdo do artigo histórico é renderizado em modo de leitura na nova aba do navegador, exibindo o texto principal e os hiperlinks funcionais.</w:t>
+        <w:t>1. O conteúdo do artigo histórico é renderizado em modo de leitura na janela sobreposta, exibindo o título, a data, o nome do autor que registrou o PIN e o texto principal com as mídias já incorporadas.</w:t>
       </w:r>
     </w:p>
     <w:p>
@@ -17141,7 +17141,7 @@
                 <w:noProof w:val="0"/>
                 <w:lang w:val="pt-BR"/>
               </w:rPr>
-              <w:t>Sim</w:t>
+              <w:t>Não</w:t>
             </w:r>
           </w:p>
         </w:tc>
@@ -17253,7 +17253,7 @@
                 <w:noProof w:val="0"/>
                 <w:lang w:val="pt-BR"/>
               </w:rPr>
-              <w:t>Sim</w:t>
+              <w:t>Não</w:t>
             </w:r>
           </w:p>
         </w:tc>
@@ -18339,7 +18339,7 @@
                 <w:noProof w:val="0"/>
                 <w:lang w:val="pt-BR"/>
               </w:rPr>
-              <w:t>Latitude</w:t>
+              <w:t>Longitude</w:t>
             </w:r>
           </w:p>
           <w:p>
@@ -21692,7 +21692,7 @@
           <w:noProof w:val="0"/>
           <w:lang w:val="pt-BR"/>
         </w:rPr>
-        <w:t>1. Este fluxo se inicia quando o usuário insere ou clica em uma URL formatada no padrão “/UrlDoUsuario” no navegador de internet.</w:t>
+        <w:t>1. Este fluxo se inicia quando o usuário insere ou clica em uma URL formatada no padrão “/UrlDoUsuario” no navegador de internet, como em “/fernando”. O endereço é gerado a partir do nome informado no cadastro.</w:t>
       </w:r>
     </w:p>
     <w:p>
@@ -23807,7 +23807,7 @@
         <w:jc w:val="both"/>
       </w:pPr>
       <w:r>
-        <w:t>A persistência ocorre através do banco de dados relacional PostgreSQL. A escolha justifica-se pela robustez no tratamento de integridade referencial e pela facilidade de escalar o armazenamento de registros históricos.</w:t>
+        <w:t>A persistência ocorre através do banco de dados relacional PostgreSQL, hospedado na plataforma Supabase. A escolha justifica-se pela robustez no tratamento de integridade referencial e pela facilidade de escalar o armazenamento de registros históricos. Em produção, a conexão utiliza o modo de agrupamento de conexões (Transaction pooler), exigido pelo ambiente de execução sem servidor descrito na seção de arquitetura.</w:t>
       </w:r>
     </w:p>
     <w:p>

</xml_diff>